<commit_message>
feat: completar fases 4–6 — Notas, caso del portafolio y QA
- Notas: /notas (filtro por pilar), /notas/[slug], RSS, OG, BlogPosting,
  post_read, bloque LinkedIn, "Últimas notas" en la home y Notas en el menú
- 4 notas: eventos GA4, validación de correos, 3 tareas para PYMES,
  rediseño del portafolio
- Caso "Este portafolio" (−59 % de JS inicial, con método) publicado;
  Dearel como borrador hasta tener la base del −30 %
- CV alineado al posicionamiento (sin MarTech/CRO) y PDF regenerado
- QA Fase 5: OG de /privacidad, descripción ≤ 160 car., ubicación de
  clics en <aside>, helper sin uso eliminado (lint sin avisos)
- Docs: 05 con todas las fases y lo abierto, 02, 03, 04, 06, 07,
  decisiones.md (hipótesis H1–H3, dominio, inglés) y README
</commit_message>
<xml_diff>
--- a/content/cv/CV-Sebastian-Jaque.docx
+++ b/content/cv/CV-Sebastian-Jaque.docx
@@ -31,7 +31,7 @@
           <w:sz w:val="22"/>
           <w:szCs w:val="22"/>
         </w:rPr>
-        <w:t xml:space="preserve">Desarrollo Web  ·  Automatización de Procesos  ·  MarTech &amp; CRO</w:t>
+        <w:t xml:space="preserve">Desarrollo Web  ·  Automatización de Procesos  ·  Integraciones</w:t>
       </w:r>
     </w:p>
     <w:p>
@@ -155,7 +155,7 @@
           <w:sz w:val="19"/>
           <w:szCs w:val="19"/>
         </w:rPr>
-        <w:t xml:space="preserve">Estudiante de último ciclo de Administración y Negocios Internacionales que construye herramientas digitales para el negocio: plataformas web con Next.js, automatizaciones con APIs y medición de marketing. Experiencia en retail, operaciones, marketing digital y sector educativo, conectando el problema de negocio con la solución técnica. Interesado en roles de MarTech, desarrollo web y CRO, y automatización de procesos.</w:t>
+        <w:t xml:space="preserve">Estudiante de último ciclo de Administración y Negocios Internacionales que construye herramientas digitales para el negocio: plataformas web con Next.js, automatizaciones con Python y APIs, e integraciones entre plataformas. Experiencia en retail, operaciones, marketing digital y sector educativo, conectando el problema de negocio con la solución técnica. Interesado en roles de desarrollo web, automatización de procesos e integraciones.</w:t>
       </w:r>
     </w:p>
     <w:p>
@@ -926,15 +926,15 @@
           <w:sz w:val="19"/>
           <w:szCs w:val="19"/>
         </w:rPr>
-        <w:t xml:space="preserve">Marketing y analítica: </w:t>
-      </w:r>
-      <w:r>
-        <w:rPr>
-          <w:rFonts w:ascii="Calibri" w:cs="Calibri" w:eastAsia="Calibri" w:hAnsi="Calibri"/>
-          <w:sz w:val="19"/>
-          <w:szCs w:val="19"/>
-        </w:rPr>
-        <w:t xml:space="preserve">Google Analytics 4, Google Tag Manager, SEO, CRO, Power BI</w:t>
+        <w:t xml:space="preserve">SEO y analítica: </w:t>
+      </w:r>
+      <w:r>
+        <w:rPr>
+          <w:rFonts w:ascii="Calibri" w:cs="Calibri" w:eastAsia="Calibri" w:hAnsi="Calibri"/>
+          <w:sz w:val="19"/>
+          <w:szCs w:val="19"/>
+        </w:rPr>
+        <w:t xml:space="preserve">SEO, Google Analytics 4 (en certificación), Power BI</w:t>
       </w:r>
     </w:p>
     <w:p>

</xml_diff>

<commit_message>
feat: update portfolio content, case studies, CV, and project images
</commit_message>
<xml_diff>
--- a/content/cv/CV-Sebastian-Jaque.docx
+++ b/content/cv/CV-Sebastian-Jaque.docx
@@ -262,17 +262,17 @@
           <w:sz w:val="19"/>
           <w:szCs w:val="19"/>
         </w:rPr>
-        <w:t xml:space="preserve">Construí un sistema de difusión por correo con segmentación, personalización y lista de exclusión (Ley 29733): una campaña de 8 000 destinatarios pasó de más de 4 h a </w:t>
-      </w:r>
-      <w:r>
-        <w:rPr>
-          <w:rFonts w:ascii="Calibri" w:cs="Calibri" w:eastAsia="Calibri" w:hAnsi="Calibri"/>
-          <w:b/>
-          <w:bCs/>
-          <w:sz w:val="19"/>
-          <w:szCs w:val="19"/>
-        </w:rPr>
-        <w:t xml:space="preserve">~2 min</w:t>
+        <w:t xml:space="preserve">Construí un sistema de difusión por correo con segmentación, personalización y lista de exclusión (Ley 29733): el envío de campañas pasó de horas a </w:t>
+      </w:r>
+      <w:r>
+        <w:rPr>
+          <w:rFonts w:ascii="Calibri" w:cs="Calibri" w:eastAsia="Calibri" w:hAnsi="Calibri"/>
+          <w:b/>
+          <w:bCs/>
+          <w:sz w:val="19"/>
+          <w:szCs w:val="19"/>
+        </w:rPr>
+        <w:t xml:space="preserve">tan solo minutos</w:t>
       </w:r>
       <w:r>
         <w:rPr>

</xml_diff>